<commit_message>
Resolve 'framework' term collision: Process section no longer calls itself a framework, article's 10 body sections un-numbered so only the genuine 7-part model carries a count, Go-deeper panel previews that count before the click-through
</commit_message>
<xml_diff>
--- a/content/articles/The_CrystalWell_Investment_Framework.docx
+++ b/content/articles/The_CrystalWell_Investment_Framework.docx
@@ -207,7 +207,7 @@
       <w:bookmarkStart w:id="3" w:name="Xa0125fe1d83bac64506622f0044d0c1701d83fd"/>
       <w:bookmarkEnd w:id="2"/>
       <w:r>
-        <w:t>1. Start With Valuation and a Margin of Safety</w:t>
+        <w:t>Start With Valuation and a Margin of Safety</w:t>
       </w:r>
     </w:p>
     <w:p>
@@ -310,7 +310,7 @@
       <w:bookmarkStart w:id="4" w:name="understand-why-the-market-is-pessimistic"/>
       <w:bookmarkEnd w:id="3"/>
       <w:r>
-        <w:t>2. Understand Why the Market Is Pessimistic</w:t>
+        <w:t>Understand Why the Market Is Pessimistic</w:t>
       </w:r>
     </w:p>
     <w:p>
@@ -498,7 +498,7 @@
       <w:bookmarkStart w:id="5" w:name="identify-a-path-to-revaluation"/>
       <w:bookmarkEnd w:id="4"/>
       <w:r>
-        <w:t>3. Identify a Path to Revaluation</w:t>
+        <w:t>Identify a Path to Revaluation</w:t>
       </w:r>
     </w:p>
     <w:p>
@@ -732,7 +732,7 @@
       <w:bookmarkStart w:id="6" w:name="follow-managements-actions"/>
       <w:bookmarkEnd w:id="5"/>
       <w:r>
-        <w:t>4. Follow Management’s Actions</w:t>
+        <w:t>Follow Management’s Actions</w:t>
       </w:r>
     </w:p>
     <w:p>
@@ -856,7 +856,7 @@
       <w:bookmarkStart w:id="7" w:name="think-in-scenarios-and-probabilities"/>
       <w:bookmarkEnd w:id="6"/>
       <w:r>
-        <w:t>5. Think in Scenarios and Probabilities</w:t>
+        <w:t>Think in Scenarios and Probabilities</w:t>
       </w:r>
     </w:p>
     <w:p>
@@ -1007,7 +1007,7 @@
       <w:bookmarkStart w:id="8" w:name="separate-price-from-fundamentals"/>
       <w:bookmarkEnd w:id="7"/>
       <w:r>
-        <w:t>6. Separate Price From Fundamentals</w:t>
+        <w:t>Separate Price From Fundamentals</w:t>
       </w:r>
     </w:p>
     <w:p>
@@ -1129,7 +1129,7 @@
       <w:bookmarkStart w:id="9" w:name="X6b22a5f7884e5609c621c3e5109b302ab582ee0"/>
       <w:bookmarkEnd w:id="8"/>
       <w:r>
-        <w:t>7. Let Patience Work—Without Confusing It With Stubbornness</w:t>
+        <w:t>Let Patience Work—Without Confusing It With Stubbornness</w:t>
       </w:r>
     </w:p>
     <w:p>
@@ -1230,8 +1230,7 @@
       <w:bookmarkStart w:id="10" w:name="X13e9a068953365d9a99dadce7f272e66b0a24f8"/>
       <w:bookmarkEnd w:id="9"/>
       <w:r>
-        <w:lastRenderedPageBreak/>
-        <w:t>8. Use Options as a Tool, Not a Strategy by Default</w:t>
+        <w:t>Use Options as a Tool, Not a Strategy by Default</w:t>
       </w:r>
     </w:p>
     <w:p>
@@ -1352,7 +1351,7 @@
       <w:bookmarkStart w:id="11" w:name="define-what-would-prove-the-thesis-wrong"/>
       <w:bookmarkEnd w:id="10"/>
       <w:r>
-        <w:t>9. Define What Would Prove the Thesis Wrong</w:t>
+        <w:t>Define What Would Prove the Thesis Wrong</w:t>
       </w:r>
     </w:p>
     <w:p>
@@ -1536,7 +1535,7 @@
       <w:bookmarkStart w:id="12" w:name="X56425a4dc91bbba4d5ac5ebfc3878d7f9b42f2e"/>
       <w:bookmarkEnd w:id="11"/>
       <w:r>
-        <w:t>10. Accept That Attractive Opportunities Often Feel Uncomfortable</w:t>
+        <w:t>Accept That Attractive Opportunities Often Feel Uncomfortable</w:t>
       </w:r>
     </w:p>
     <w:p>

</xml_diff>

<commit_message>
Update article publish dates (Insider->Dec 19 2025, Framework->Oct 18 2025); remove all samuelstocks references sitewide and in code/docs, fixing a stale TODO in DESIGN.md along the way
</commit_message>
<xml_diff>
--- a/content/articles/The_CrystalWell_Investment_Framework.docx
+++ b/content/articles/The_CrystalWell_Investment_Framework.docx
@@ -30,14 +30,14 @@
           <w:b/>
           <w:bCs/>
         </w:rPr>
-        <w:t>July</w:t>
+        <w:t>October</w:t>
       </w:r>
       <w:r>
         <w:rPr>
           <w:b/>
           <w:bCs/>
         </w:rPr>
-        <w:t xml:space="preserve"> 17, 2026</w:t>
+        <w:t xml:space="preserve"> 18, 2025</w:t>
       </w:r>
     </w:p>
     <w:p>

</xml_diff>